<commit_message>
docs: refresh README screenshot + add themed RAG diagram to courseware
- Replace stale HR/IT dashboard image with a live Finance Advisor screenshot
  (screenshot.png) and update the README caption + structure; remove dashboard.png
- Add a brand-themed RAG flow diagram (courseware/assets/rag-flow.png) to the
  slide deck (RAG section) and the Learner Guide
- Sync wsq-course-slides / wsq-learner-guide skill templates

Co-Authored-By: Claude Opus 4.8 (1M context) <noreply@anthropic.com>
</commit_message>
<xml_diff>
--- a/courseware/n8n Automation Learner Guide.docx
+++ b/courseware/n8n Automation Learner Guide.docx
@@ -3908,292 +3908,12 @@
     </w:p>
     <w:p>
       <w:pPr>
-        <w:pStyle w:val="Heading2"/>
-      </w:pPr>
-      <w:r>
-        <w:t>Step-by-step</w:t>
-      </w:r>
-    </w:p>
-    <w:p>
-      <w:pPr>
-        <w:pStyle w:val="ListNumber"/>
-      </w:pPr>
-      <w:r>
-        <w:t xml:space="preserve">Prepare knowledge documents. Use the provided </w:t>
-      </w:r>
-      <w:r>
-        <w:rPr>
-          <w:rFonts w:ascii="Consolas" w:hAnsi="Consolas"/>
-          <w:color w:val="C7254E"/>
-        </w:rPr>
-        <w:t>MyCompany-HR-SOP.docx</w:t>
-      </w:r>
-      <w:r>
-        <w:t xml:space="preserve"> and </w:t>
-      </w:r>
-      <w:r>
-        <w:rPr>
-          <w:rFonts w:ascii="Consolas" w:hAnsi="Consolas"/>
-          <w:color w:val="C7254E"/>
-        </w:rPr>
-        <w:t>MyCompany-IT-Support-FAQ.docx</w:t>
-      </w:r>
-      <w:r>
-        <w:t>, or generate fresh ones with Claude Code (e.g. an employee-benefits FAQ or product info).</w:t>
-      </w:r>
-    </w:p>
-    <w:p>
-      <w:pPr>
-        <w:pStyle w:val="ListNumber"/>
-      </w:pPr>
-      <w:r>
-        <w:t xml:space="preserve">Build the </w:t>
-      </w:r>
-      <w:r>
-        <w:rPr>
-          <w:b/>
-        </w:rPr>
-        <w:t>ingestion</w:t>
-      </w:r>
-      <w:r>
-        <w:t xml:space="preserve"> path: an upload point → </w:t>
-      </w:r>
-      <w:r>
-        <w:rPr>
-          <w:b/>
-        </w:rPr>
-        <w:t>Embeddings (OpenAI)</w:t>
-      </w:r>
-      <w:r>
-        <w:t xml:space="preserve"> → </w:t>
-      </w:r>
-      <w:r>
-        <w:rPr>
-          <w:b/>
-        </w:rPr>
-        <w:t>Vector Store (Insert)</w:t>
-      </w:r>
-      <w:r>
-        <w:t xml:space="preserve"> with a </w:t>
-      </w:r>
-      <w:r>
-        <w:rPr>
-          <w:b/>
-        </w:rPr>
-        <w:t>Default Data Loader</w:t>
-      </w:r>
-      <w:r>
-        <w:t xml:space="preserve"> so your documents are embedded and stored.</w:t>
-      </w:r>
-    </w:p>
-    <w:p>
-      <w:pPr>
-        <w:pStyle w:val="ListNumber"/>
-      </w:pPr>
-      <w:r>
-        <w:t xml:space="preserve">In your Telegram agent, add a </w:t>
-      </w:r>
-      <w:r>
-        <w:rPr>
-          <w:b/>
-        </w:rPr>
-        <w:t>Vector Store</w:t>
-      </w:r>
-      <w:r>
-        <w:t xml:space="preserve"> retrieval </w:t>
-      </w:r>
-      <w:r>
-        <w:rPr>
-          <w:b/>
-        </w:rPr>
-        <w:t>tool</w:t>
-      </w:r>
-      <w:r>
-        <w:t xml:space="preserve"> (the RAG source) alongside the existing </w:t>
-      </w:r>
-      <w:r>
-        <w:rPr>
-          <w:b/>
-        </w:rPr>
-        <w:t>Data Table</w:t>
-      </w:r>
-      <w:r>
-        <w:t xml:space="preserve"> tool — the agent now has </w:t>
-      </w:r>
-      <w:r>
-        <w:rPr>
-          <w:b/>
-        </w:rPr>
-        <w:t>two</w:t>
-      </w:r>
-      <w:r>
-        <w:t xml:space="preserve"> data sources.</w:t>
-      </w:r>
-    </w:p>
-    <w:p>
-      <w:pPr>
-        <w:pStyle w:val="ListNumber"/>
-      </w:pPr>
-      <w:r>
-        <w:t xml:space="preserve">Rewrite the </w:t>
-      </w:r>
-      <w:r>
-        <w:rPr>
-          <w:b/>
-        </w:rPr>
-        <w:t>System Instruction</w:t>
-      </w:r>
-      <w:r>
-        <w:t xml:space="preserve"> to route correctly: "Use the </w:t>
-      </w:r>
-      <w:r>
-        <w:rPr>
-          <w:b/>
-        </w:rPr>
-        <w:t>Knowledge Base</w:t>
-      </w:r>
-      <w:r>
-        <w:t xml:space="preserve"> tool for policy/FAQ questions and the </w:t>
-      </w:r>
-      <w:r>
-        <w:rPr>
-          <w:b/>
-        </w:rPr>
-        <w:t>Employees</w:t>
-      </w:r>
-      <w:r>
-        <w:t xml:space="preserve"> tool for staff-record questions. Never mix the two."</w:t>
-      </w:r>
-    </w:p>
-    <w:p>
-      <w:pPr>
-        <w:pStyle w:val="ListNumber"/>
-      </w:pPr>
-      <w:r>
-        <w:rPr>
-          <w:b/>
-        </w:rPr>
-        <w:t>Save</w:t>
-      </w:r>
-      <w:r>
-        <w:t xml:space="preserve"> and keep </w:t>
-      </w:r>
-      <w:r>
-        <w:rPr>
-          <w:b/>
-        </w:rPr>
-        <w:t>Active</w:t>
-      </w:r>
-      <w:r>
-        <w:t>.</w:t>
-      </w:r>
-    </w:p>
-    <w:p>
-      <w:pPr>
-        <w:shd w:val="clear" w:color="auto" w:fill="FFF4E5"/>
-      </w:pPr>
-      <w:r>
-        <w:rPr>
-          <w:b/>
-          <w:color w:val="B56A00"/>
-        </w:rPr>
-        <w:t xml:space="preserve">Note:  </w:t>
-      </w:r>
-      <w:r>
-        <w:t>Get a few learners to present their chatbot and show it answering both a policy question (RAG) and a staff-record question (Data Table).</w:t>
-      </w:r>
-    </w:p>
-    <w:p>
-      <w:pPr>
-        <w:shd w:val="clear" w:color="auto" w:fill="E8F7EE"/>
-      </w:pPr>
-      <w:r>
-        <w:rPr>
-          <w:b/>
-          <w:color w:val="127A3E"/>
-        </w:rPr>
-        <w:t xml:space="preserve">✅ Test it:  </w:t>
-      </w:r>
-      <w:r>
-        <w:t>Ask a policy question ("How many days of annual leave do I get?") and a record question ("What is Alice's role?") and confirm each is answered from the correct source.</w:t>
-      </w:r>
-    </w:p>
-    <w:p>
-      <w:pPr>
-        <w:spacing w:before="40" w:after="40"/>
-        <w:pBdr>
-          <w:bottom w:val="single" w:sz="6" w:space="1" w:color="D0D7DE"/>
-        </w:pBdr>
-      </w:pPr>
-    </w:p>
-    <w:p>
-      <w:pPr>
-        <w:pStyle w:val="Heading1"/>
-      </w:pPr>
-      <w:r>
-        <w:t>Activity 6 — Website Chatbot via Webhook (Investment Advisor)</w:t>
-      </w:r>
-    </w:p>
-    <w:p>
-      <w:r>
-        <w:rPr>
-          <w:b/>
-        </w:rPr>
-        <w:t>Folder:</w:t>
-      </w:r>
-      <w:r>
-        <w:t xml:space="preserve"> </w:t>
-      </w:r>
-      <w:r>
-        <w:rPr>
-          <w:rFonts w:ascii="Consolas" w:hAnsi="Consolas"/>
-          <w:color w:val="C7254E"/>
-        </w:rPr>
-        <w:t>labs/activity6-investment-advisor/</w:t>
-      </w:r>
-      <w:r>
-        <w:t xml:space="preserve">  ·  Reference: https://alfredang.github.io/n8n-investmentadvisor/</w:t>
-      </w:r>
-    </w:p>
-    <w:p>
-      <w:pPr>
-        <w:pStyle w:val="Heading2"/>
-      </w:pPr>
-      <w:r>
-        <w:t>Goal</w:t>
-      </w:r>
-    </w:p>
-    <w:p>
-      <w:r>
-        <w:t xml:space="preserve">Expose an AI agent to a </w:t>
-      </w:r>
-      <w:r>
-        <w:rPr>
-          <w:b/>
-        </w:rPr>
-        <w:t>public website</w:t>
-      </w:r>
-      <w:r>
-        <w:t xml:space="preserve"> using a </w:t>
-      </w:r>
-      <w:r>
-        <w:rPr>
-          <w:b/>
-        </w:rPr>
-        <w:t>Webhook</w:t>
-      </w:r>
-      <w:r>
-        <w:t>. The provided one-page Investment Advisor site has an enquiry form and a floating chatbot; both POST to a single n8n webhook, which routes to an email-the-advisor path and an AI-chat path.</w:t>
-      </w:r>
-    </w:p>
-    <w:p>
-      <w:pPr>
         <w:jc w:val="center"/>
       </w:pPr>
       <w:r>
         <w:drawing>
           <wp:inline xmlns:a="http://schemas.openxmlformats.org/drawingml/2006/main" xmlns:pic="http://schemas.openxmlformats.org/drawingml/2006/picture">
-            <wp:extent cx="5669280" cy="3371197"/>
+            <wp:extent cx="5669280" cy="2854577"/>
             <wp:docPr id="10" name="Picture 10"/>
             <wp:cNvGraphicFramePr>
               <a:graphicFrameLocks noChangeAspect="1"/>
@@ -4202,7 +3922,7 @@
               <a:graphicData uri="http://schemas.openxmlformats.org/drawingml/2006/picture">
                 <pic:pic>
                   <pic:nvPicPr>
-                    <pic:cNvPr id="0" name="Activity6-Investment-Advisor.png"/>
+                    <pic:cNvPr id="0" name="rag-flow.png"/>
                     <pic:cNvPicPr/>
                   </pic:nvPicPr>
                   <pic:blipFill>
@@ -4214,7 +3934,7 @@
                   <pic:spPr>
                     <a:xfrm>
                       <a:off x="0" y="0"/>
-                      <a:ext cx="5669280" cy="3371197"/>
+                      <a:ext cx="5669280" cy="2854577"/>
                     </a:xfrm>
                     <a:prstGeom prst="rect"/>
                   </pic:spPr>
@@ -4235,7 +3955,7 @@
           <w:color w:val="555B66"/>
           <w:sz w:val="18"/>
         </w:rPr>
-        <w:t>Activity 6 workflow — Webhook chatbot + enquiry</w:t>
+        <w:t>How RAG works — User → Prompt → Data Retrieval (search/retrieve over your data sources) → Generator → Response</w:t>
       </w:r>
     </w:p>
     <w:p>
@@ -4243,120 +3963,35 @@
         <w:pStyle w:val="Heading2"/>
       </w:pPr>
       <w:r>
-        <w:t>Concepts — Webhooks</w:t>
+        <w:t>Step-by-step</w:t>
       </w:r>
     </w:p>
     <w:p>
       <w:pPr>
-        <w:pStyle w:val="ListBullet"/>
-      </w:pPr>
-      <w:r>
-        <w:t xml:space="preserve">A </w:t>
-      </w:r>
-      <w:r>
-        <w:rPr>
-          <w:b/>
-        </w:rPr>
-        <w:t>Webhook</w:t>
-      </w:r>
-      <w:r>
-        <w:t xml:space="preserve"> is a URL that external systems (a website, another app) call to </w:t>
-      </w:r>
-      <w:r>
-        <w:rPr>
-          <w:b/>
-        </w:rPr>
-        <w:t>trigger</w:t>
-      </w:r>
-      <w:r>
-        <w:t xml:space="preserve"> your workflow.</w:t>
-      </w:r>
-    </w:p>
-    <w:p>
-      <w:pPr>
-        <w:pStyle w:val="ListBullet"/>
-      </w:pPr>
-      <w:r>
-        <w:t>Use cases: website chat, form submissions, payment events, GitHub/Stripe notifications — any external trigger.</w:t>
-      </w:r>
-    </w:p>
-    <w:p>
-      <w:pPr>
-        <w:pStyle w:val="ListBullet"/>
-      </w:pPr>
-      <w:r>
-        <w:t xml:space="preserve">Pair the Webhook trigger with a </w:t>
-      </w:r>
-      <w:r>
-        <w:rPr>
-          <w:b/>
-        </w:rPr>
-        <w:t>Respond to Webhook</w:t>
-      </w:r>
-      <w:r>
-        <w:t xml:space="preserve"> node to send a reply back to the caller.</w:t>
-      </w:r>
-    </w:p>
-    <w:p>
-      <w:pPr>
-        <w:pStyle w:val="Heading2"/>
-      </w:pPr>
-      <w:r>
-        <w:t>Step-by-step</w:t>
-      </w:r>
-    </w:p>
-    <w:p>
-      <w:pPr>
         <w:pStyle w:val="ListNumber"/>
       </w:pPr>
       <w:r>
-        <w:t xml:space="preserve">Import </w:t>
+        <w:t xml:space="preserve">Prepare knowledge documents. Use the provided </w:t>
       </w:r>
       <w:r>
         <w:rPr>
           <w:rFonts w:ascii="Consolas" w:hAnsi="Consolas"/>
           <w:color w:val="C7254E"/>
         </w:rPr>
-        <w:t>Activity6-Investment-Advisor.json</w:t>
-      </w:r>
-      <w:r>
-        <w:t xml:space="preserve"> into n8n.</w:t>
-      </w:r>
-    </w:p>
-    <w:p>
-      <w:pPr>
-        <w:pStyle w:val="ListNumber"/>
-      </w:pPr>
-      <w:r>
-        <w:t xml:space="preserve">Open the </w:t>
-      </w:r>
-      <w:r>
-        <w:rPr>
-          <w:b/>
-        </w:rPr>
-        <w:t>Webhook</w:t>
-      </w:r>
-      <w:r>
-        <w:t xml:space="preserve"> node(s) and ensure </w:t>
-      </w:r>
-      <w:r>
-        <w:rPr>
-          <w:b/>
-        </w:rPr>
-        <w:t>Allowed Origins (CORS)</w:t>
-      </w:r>
-      <w:r>
-        <w:t xml:space="preserve"> is </w:t>
+        <w:t>MyCompany-HR-SOP.docx</w:t>
+      </w:r>
+      <w:r>
+        <w:t xml:space="preserve"> and </w:t>
       </w:r>
       <w:r>
         <w:rPr>
           <w:rFonts w:ascii="Consolas" w:hAnsi="Consolas"/>
           <w:color w:val="C7254E"/>
         </w:rPr>
-        <w:t>*</w:t>
-      </w:r>
-      <w:r>
-        <w:t xml:space="preserve"> so the browser page can call it.</w:t>
+        <w:t>MyCompany-IT-Support-FAQ.docx</w:t>
+      </w:r>
+      <w:r>
+        <w:t>, or generate fresh ones with Claude Code (e.g. an employee-benefits FAQ or product info).</w:t>
       </w:r>
     </w:p>
     <w:p>
@@ -4364,25 +3999,43 @@
         <w:pStyle w:val="ListNumber"/>
       </w:pPr>
       <w:r>
-        <w:t xml:space="preserve">Re-select your </w:t>
+        <w:t xml:space="preserve">Build the </w:t>
       </w:r>
       <w:r>
         <w:rPr>
           <w:b/>
         </w:rPr>
-        <w:t>OpenAI</w:t>
-      </w:r>
-      <w:r>
-        <w:t xml:space="preserve"> and </w:t>
+        <w:t>ingestion</w:t>
+      </w:r>
+      <w:r>
+        <w:t xml:space="preserve"> path: an upload point → </w:t>
       </w:r>
       <w:r>
         <w:rPr>
           <w:b/>
         </w:rPr>
-        <w:t>Gmail</w:t>
-      </w:r>
-      <w:r>
-        <w:t xml:space="preserve"> credentials on the AI Agent and Email nodes.</w:t>
+        <w:t>Embeddings (OpenAI)</w:t>
+      </w:r>
+      <w:r>
+        <w:t xml:space="preserve"> → </w:t>
+      </w:r>
+      <w:r>
+        <w:rPr>
+          <w:b/>
+        </w:rPr>
+        <w:t>Vector Store (Insert)</w:t>
+      </w:r>
+      <w:r>
+        <w:t xml:space="preserve"> with a </w:t>
+      </w:r>
+      <w:r>
+        <w:rPr>
+          <w:b/>
+        </w:rPr>
+        <w:t>Default Data Loader</w:t>
+      </w:r>
+      <w:r>
+        <w:t xml:space="preserve"> so your documents are embedded and stored.</w:t>
       </w:r>
     </w:p>
     <w:p>
@@ -4390,7 +4043,78 @@
         <w:pStyle w:val="ListNumber"/>
       </w:pPr>
       <w:r>
-        <w:t>Review the agent's compliance system instruction (no guaranteed returns, no personalised advice).</w:t>
+        <w:t xml:space="preserve">In your Telegram agent, add a </w:t>
+      </w:r>
+      <w:r>
+        <w:rPr>
+          <w:b/>
+        </w:rPr>
+        <w:t>Vector Store</w:t>
+      </w:r>
+      <w:r>
+        <w:t xml:space="preserve"> retrieval </w:t>
+      </w:r>
+      <w:r>
+        <w:rPr>
+          <w:b/>
+        </w:rPr>
+        <w:t>tool</w:t>
+      </w:r>
+      <w:r>
+        <w:t xml:space="preserve"> (the RAG source) alongside the existing </w:t>
+      </w:r>
+      <w:r>
+        <w:rPr>
+          <w:b/>
+        </w:rPr>
+        <w:t>Data Table</w:t>
+      </w:r>
+      <w:r>
+        <w:t xml:space="preserve"> tool — the agent now has </w:t>
+      </w:r>
+      <w:r>
+        <w:rPr>
+          <w:b/>
+        </w:rPr>
+        <w:t>two</w:t>
+      </w:r>
+      <w:r>
+        <w:t xml:space="preserve"> data sources.</w:t>
+      </w:r>
+    </w:p>
+    <w:p>
+      <w:pPr>
+        <w:pStyle w:val="ListNumber"/>
+      </w:pPr>
+      <w:r>
+        <w:t xml:space="preserve">Rewrite the </w:t>
+      </w:r>
+      <w:r>
+        <w:rPr>
+          <w:b/>
+        </w:rPr>
+        <w:t>System Instruction</w:t>
+      </w:r>
+      <w:r>
+        <w:t xml:space="preserve"> to route correctly: "Use the </w:t>
+      </w:r>
+      <w:r>
+        <w:rPr>
+          <w:b/>
+        </w:rPr>
+        <w:t>Knowledge Base</w:t>
+      </w:r>
+      <w:r>
+        <w:t xml:space="preserve"> tool for policy/FAQ questions and the </w:t>
+      </w:r>
+      <w:r>
+        <w:rPr>
+          <w:b/>
+        </w:rPr>
+        <w:t>Employees</w:t>
+      </w:r>
+      <w:r>
+        <w:t xml:space="preserve"> tool for staff-record questions. Never mix the two."</w:t>
       </w:r>
     </w:p>
     <w:p>
@@ -4404,7 +4128,7 @@
         <w:t>Save</w:t>
       </w:r>
       <w:r>
-        <w:t xml:space="preserve">, toggle </w:t>
+        <w:t xml:space="preserve"> and keep </w:t>
       </w:r>
       <w:r>
         <w:rPr>
@@ -4413,34 +4137,7 @@
         <w:t>Active</w:t>
       </w:r>
       <w:r>
-        <w:t xml:space="preserve">, and copy the webhook </w:t>
-      </w:r>
-      <w:r>
-        <w:rPr>
-          <w:b/>
-        </w:rPr>
-        <w:t>Production URL</w:t>
-      </w:r>
-      <w:r>
         <w:t>.</w:t>
-      </w:r>
-    </w:p>
-    <w:p>
-      <w:pPr>
-        <w:pStyle w:val="ListNumber"/>
-      </w:pPr>
-      <w:r>
-        <w:t xml:space="preserve">Open </w:t>
-      </w:r>
-      <w:r>
-        <w:rPr>
-          <w:rFonts w:ascii="Consolas" w:hAnsi="Consolas"/>
-          <w:color w:val="C7254E"/>
-        </w:rPr>
-        <w:t>index.html</w:t>
-      </w:r>
-      <w:r>
-        <w:t xml:space="preserve"> from the activity folder, click the settings/gear, and paste your webhook URL.</w:t>
       </w:r>
     </w:p>
     <w:p>
@@ -4455,7 +4152,7 @@
         <w:t xml:space="preserve">Note:  </w:t>
       </w:r>
       <w:r>
-        <w:t>Get a few learners to present their live website and chatbot.</w:t>
+        <w:t>Get a few learners to present their chatbot and show it answering both a policy question (RAG) and a staff-record question (Data Table).</w:t>
       </w:r>
     </w:p>
     <w:p>
@@ -4470,7 +4167,7 @@
         <w:t xml:space="preserve">✅ Test it:  </w:t>
       </w:r>
       <w:r>
-        <w:t>On the website, send a chat message and submit the enquiry form; confirm the bot replies and the advisor receives the enquiry email.</w:t>
+        <w:t>Ask a policy question ("How many days of annual leave do I get?") and a record question ("What is Alice's role?") and confirm each is answered from the correct source.</w:t>
       </w:r>
     </w:p>
     <w:p>
@@ -4486,7 +4183,7 @@
         <w:pStyle w:val="Heading1"/>
       </w:pPr>
       <w:r>
-        <w:t>Activity 7 — Finance API → Telegram (AI Day-Trading Agent)</w:t>
+        <w:t>Activity 6 — Website Chatbot via Webhook (Investment Advisor)</w:t>
       </w:r>
     </w:p>
     <w:p>
@@ -4504,10 +4201,10 @@
           <w:rFonts w:ascii="Consolas" w:hAnsi="Consolas"/>
           <w:color w:val="C7254E"/>
         </w:rPr>
-        <w:t>labs/activity7-finance-advisor/</w:t>
-      </w:r>
-      <w:r>
-        <w:t xml:space="preserve">  ·  Reference: https://alfredang.github.io/n8n-financeadvisor/</w:t>
+        <w:t>labs/activity6-investment-advisor/</w:t>
+      </w:r>
+      <w:r>
+        <w:t xml:space="preserve">  ·  Reference: https://alfredang.github.io/n8n-investmentadvisor/</w:t>
       </w:r>
     </w:p>
     <w:p>
@@ -4520,34 +4217,25 @@
     </w:p>
     <w:p>
       <w:r>
-        <w:t xml:space="preserve">Combine </w:t>
+        <w:t xml:space="preserve">Expose an AI agent to a </w:t>
       </w:r>
       <w:r>
         <w:rPr>
           <w:b/>
         </w:rPr>
-        <w:t>APIs/HTTP Requests</w:t>
-      </w:r>
-      <w:r>
-        <w:t xml:space="preserve"> with an AI agent. Ask the Telegram bot about a stock; it resolves the ticker, pulls </w:t>
+        <w:t>public website</w:t>
+      </w:r>
+      <w:r>
+        <w:t xml:space="preserve"> using a </w:t>
       </w:r>
       <w:r>
         <w:rPr>
           <w:b/>
         </w:rPr>
-        <w:t>multi-timeframe candles from Twelve Data</w:t>
-      </w:r>
-      <w:r>
-        <w:t xml:space="preserve"> and </w:t>
-      </w:r>
-      <w:r>
-        <w:rPr>
-          <w:b/>
-        </w:rPr>
-        <w:t>headlines from NewsAPI</w:t>
-      </w:r>
-      <w:r>
-        <w:t>, and replies with a Buy / Sell / Hold call and reasoning. A companion dashboard shows live price and charts.</w:t>
+        <w:t>Webhook</w:t>
+      </w:r>
+      <w:r>
+        <w:t>. The provided one-page Investment Advisor site has an enquiry form and a floating chatbot; both POST to a single n8n webhook, which routes to an email-the-advisor path and an AI-chat path.</w:t>
       </w:r>
     </w:p>
     <w:p>
@@ -4566,7 +4254,7 @@
               <a:graphicData uri="http://schemas.openxmlformats.org/drawingml/2006/picture">
                 <pic:pic>
                   <pic:nvPicPr>
-                    <pic:cNvPr id="0" name="Activity7-Finance-Advisor.png"/>
+                    <pic:cNvPr id="0" name="Activity6-Investment-Advisor.png"/>
                     <pic:cNvPicPr/>
                   </pic:nvPicPr>
                   <pic:blipFill>
@@ -4599,6 +4287,370 @@
           <w:color w:val="555B66"/>
           <w:sz w:val="18"/>
         </w:rPr>
+        <w:t>Activity 6 workflow — Webhook chatbot + enquiry</w:t>
+      </w:r>
+    </w:p>
+    <w:p>
+      <w:pPr>
+        <w:pStyle w:val="Heading2"/>
+      </w:pPr>
+      <w:r>
+        <w:t>Concepts — Webhooks</w:t>
+      </w:r>
+    </w:p>
+    <w:p>
+      <w:pPr>
+        <w:pStyle w:val="ListBullet"/>
+      </w:pPr>
+      <w:r>
+        <w:t xml:space="preserve">A </w:t>
+      </w:r>
+      <w:r>
+        <w:rPr>
+          <w:b/>
+        </w:rPr>
+        <w:t>Webhook</w:t>
+      </w:r>
+      <w:r>
+        <w:t xml:space="preserve"> is a URL that external systems (a website, another app) call to </w:t>
+      </w:r>
+      <w:r>
+        <w:rPr>
+          <w:b/>
+        </w:rPr>
+        <w:t>trigger</w:t>
+      </w:r>
+      <w:r>
+        <w:t xml:space="preserve"> your workflow.</w:t>
+      </w:r>
+    </w:p>
+    <w:p>
+      <w:pPr>
+        <w:pStyle w:val="ListBullet"/>
+      </w:pPr>
+      <w:r>
+        <w:t>Use cases: website chat, form submissions, payment events, GitHub/Stripe notifications — any external trigger.</w:t>
+      </w:r>
+    </w:p>
+    <w:p>
+      <w:pPr>
+        <w:pStyle w:val="ListBullet"/>
+      </w:pPr>
+      <w:r>
+        <w:t xml:space="preserve">Pair the Webhook trigger with a </w:t>
+      </w:r>
+      <w:r>
+        <w:rPr>
+          <w:b/>
+        </w:rPr>
+        <w:t>Respond to Webhook</w:t>
+      </w:r>
+      <w:r>
+        <w:t xml:space="preserve"> node to send a reply back to the caller.</w:t>
+      </w:r>
+    </w:p>
+    <w:p>
+      <w:pPr>
+        <w:pStyle w:val="Heading2"/>
+      </w:pPr>
+      <w:r>
+        <w:t>Step-by-step</w:t>
+      </w:r>
+    </w:p>
+    <w:p>
+      <w:pPr>
+        <w:pStyle w:val="ListNumber"/>
+      </w:pPr>
+      <w:r>
+        <w:t xml:space="preserve">Import </w:t>
+      </w:r>
+      <w:r>
+        <w:rPr>
+          <w:rFonts w:ascii="Consolas" w:hAnsi="Consolas"/>
+          <w:color w:val="C7254E"/>
+        </w:rPr>
+        <w:t>Activity6-Investment-Advisor.json</w:t>
+      </w:r>
+      <w:r>
+        <w:t xml:space="preserve"> into n8n.</w:t>
+      </w:r>
+    </w:p>
+    <w:p>
+      <w:pPr>
+        <w:pStyle w:val="ListNumber"/>
+      </w:pPr>
+      <w:r>
+        <w:t xml:space="preserve">Open the </w:t>
+      </w:r>
+      <w:r>
+        <w:rPr>
+          <w:b/>
+        </w:rPr>
+        <w:t>Webhook</w:t>
+      </w:r>
+      <w:r>
+        <w:t xml:space="preserve"> node(s) and ensure </w:t>
+      </w:r>
+      <w:r>
+        <w:rPr>
+          <w:b/>
+        </w:rPr>
+        <w:t>Allowed Origins (CORS)</w:t>
+      </w:r>
+      <w:r>
+        <w:t xml:space="preserve"> is </w:t>
+      </w:r>
+      <w:r>
+        <w:rPr>
+          <w:rFonts w:ascii="Consolas" w:hAnsi="Consolas"/>
+          <w:color w:val="C7254E"/>
+        </w:rPr>
+        <w:t>*</w:t>
+      </w:r>
+      <w:r>
+        <w:t xml:space="preserve"> so the browser page can call it.</w:t>
+      </w:r>
+    </w:p>
+    <w:p>
+      <w:pPr>
+        <w:pStyle w:val="ListNumber"/>
+      </w:pPr>
+      <w:r>
+        <w:t xml:space="preserve">Re-select your </w:t>
+      </w:r>
+      <w:r>
+        <w:rPr>
+          <w:b/>
+        </w:rPr>
+        <w:t>OpenAI</w:t>
+      </w:r>
+      <w:r>
+        <w:t xml:space="preserve"> and </w:t>
+      </w:r>
+      <w:r>
+        <w:rPr>
+          <w:b/>
+        </w:rPr>
+        <w:t>Gmail</w:t>
+      </w:r>
+      <w:r>
+        <w:t xml:space="preserve"> credentials on the AI Agent and Email nodes.</w:t>
+      </w:r>
+    </w:p>
+    <w:p>
+      <w:pPr>
+        <w:pStyle w:val="ListNumber"/>
+      </w:pPr>
+      <w:r>
+        <w:t>Review the agent's compliance system instruction (no guaranteed returns, no personalised advice).</w:t>
+      </w:r>
+    </w:p>
+    <w:p>
+      <w:pPr>
+        <w:pStyle w:val="ListNumber"/>
+      </w:pPr>
+      <w:r>
+        <w:rPr>
+          <w:b/>
+        </w:rPr>
+        <w:t>Save</w:t>
+      </w:r>
+      <w:r>
+        <w:t xml:space="preserve">, toggle </w:t>
+      </w:r>
+      <w:r>
+        <w:rPr>
+          <w:b/>
+        </w:rPr>
+        <w:t>Active</w:t>
+      </w:r>
+      <w:r>
+        <w:t xml:space="preserve">, and copy the webhook </w:t>
+      </w:r>
+      <w:r>
+        <w:rPr>
+          <w:b/>
+        </w:rPr>
+        <w:t>Production URL</w:t>
+      </w:r>
+      <w:r>
+        <w:t>.</w:t>
+      </w:r>
+    </w:p>
+    <w:p>
+      <w:pPr>
+        <w:pStyle w:val="ListNumber"/>
+      </w:pPr>
+      <w:r>
+        <w:t xml:space="preserve">Open </w:t>
+      </w:r>
+      <w:r>
+        <w:rPr>
+          <w:rFonts w:ascii="Consolas" w:hAnsi="Consolas"/>
+          <w:color w:val="C7254E"/>
+        </w:rPr>
+        <w:t>index.html</w:t>
+      </w:r>
+      <w:r>
+        <w:t xml:space="preserve"> from the activity folder, click the settings/gear, and paste your webhook URL.</w:t>
+      </w:r>
+    </w:p>
+    <w:p>
+      <w:pPr>
+        <w:shd w:val="clear" w:color="auto" w:fill="FFF4E5"/>
+      </w:pPr>
+      <w:r>
+        <w:rPr>
+          <w:b/>
+          <w:color w:val="B56A00"/>
+        </w:rPr>
+        <w:t xml:space="preserve">Note:  </w:t>
+      </w:r>
+      <w:r>
+        <w:t>Get a few learners to present their live website and chatbot.</w:t>
+      </w:r>
+    </w:p>
+    <w:p>
+      <w:pPr>
+        <w:shd w:val="clear" w:color="auto" w:fill="E8F7EE"/>
+      </w:pPr>
+      <w:r>
+        <w:rPr>
+          <w:b/>
+          <w:color w:val="127A3E"/>
+        </w:rPr>
+        <w:t xml:space="preserve">✅ Test it:  </w:t>
+      </w:r>
+      <w:r>
+        <w:t>On the website, send a chat message and submit the enquiry form; confirm the bot replies and the advisor receives the enquiry email.</w:t>
+      </w:r>
+    </w:p>
+    <w:p>
+      <w:pPr>
+        <w:spacing w:before="40" w:after="40"/>
+        <w:pBdr>
+          <w:bottom w:val="single" w:sz="6" w:space="1" w:color="D0D7DE"/>
+        </w:pBdr>
+      </w:pPr>
+    </w:p>
+    <w:p>
+      <w:pPr>
+        <w:pStyle w:val="Heading1"/>
+      </w:pPr>
+      <w:r>
+        <w:t>Activity 7 — Finance API → Telegram (AI Day-Trading Agent)</w:t>
+      </w:r>
+    </w:p>
+    <w:p>
+      <w:r>
+        <w:rPr>
+          <w:b/>
+        </w:rPr>
+        <w:t>Folder:</w:t>
+      </w:r>
+      <w:r>
+        <w:t xml:space="preserve"> </w:t>
+      </w:r>
+      <w:r>
+        <w:rPr>
+          <w:rFonts w:ascii="Consolas" w:hAnsi="Consolas"/>
+          <w:color w:val="C7254E"/>
+        </w:rPr>
+        <w:t>labs/activity7-finance-advisor/</w:t>
+      </w:r>
+      <w:r>
+        <w:t xml:space="preserve">  ·  Reference: https://alfredang.github.io/n8n-financeadvisor/</w:t>
+      </w:r>
+    </w:p>
+    <w:p>
+      <w:pPr>
+        <w:pStyle w:val="Heading2"/>
+      </w:pPr>
+      <w:r>
+        <w:t>Goal</w:t>
+      </w:r>
+    </w:p>
+    <w:p>
+      <w:r>
+        <w:t xml:space="preserve">Combine </w:t>
+      </w:r>
+      <w:r>
+        <w:rPr>
+          <w:b/>
+        </w:rPr>
+        <w:t>APIs/HTTP Requests</w:t>
+      </w:r>
+      <w:r>
+        <w:t xml:space="preserve"> with an AI agent. Ask the Telegram bot about a stock; it resolves the ticker, pulls </w:t>
+      </w:r>
+      <w:r>
+        <w:rPr>
+          <w:b/>
+        </w:rPr>
+        <w:t>multi-timeframe candles from Twelve Data</w:t>
+      </w:r>
+      <w:r>
+        <w:t xml:space="preserve"> and </w:t>
+      </w:r>
+      <w:r>
+        <w:rPr>
+          <w:b/>
+        </w:rPr>
+        <w:t>headlines from NewsAPI</w:t>
+      </w:r>
+      <w:r>
+        <w:t>, and replies with a Buy / Sell / Hold call and reasoning. A companion dashboard shows live price and charts.</w:t>
+      </w:r>
+    </w:p>
+    <w:p>
+      <w:pPr>
+        <w:jc w:val="center"/>
+      </w:pPr>
+      <w:r>
+        <w:drawing>
+          <wp:inline xmlns:a="http://schemas.openxmlformats.org/drawingml/2006/main" xmlns:pic="http://schemas.openxmlformats.org/drawingml/2006/picture">
+            <wp:extent cx="5669280" cy="3371197"/>
+            <wp:docPr id="12" name="Picture 12"/>
+            <wp:cNvGraphicFramePr>
+              <a:graphicFrameLocks noChangeAspect="1"/>
+            </wp:cNvGraphicFramePr>
+            <a:graphic>
+              <a:graphicData uri="http://schemas.openxmlformats.org/drawingml/2006/picture">
+                <pic:pic>
+                  <pic:nvPicPr>
+                    <pic:cNvPr id="0" name="Activity7-Finance-Advisor.png"/>
+                    <pic:cNvPicPr/>
+                  </pic:nvPicPr>
+                  <pic:blipFill>
+                    <a:blip r:embed="rId20"/>
+                    <a:stretch>
+                      <a:fillRect/>
+                    </a:stretch>
+                  </pic:blipFill>
+                  <pic:spPr>
+                    <a:xfrm>
+                      <a:off x="0" y="0"/>
+                      <a:ext cx="5669280" cy="3371197"/>
+                    </a:xfrm>
+                    <a:prstGeom prst="rect"/>
+                  </pic:spPr>
+                </pic:pic>
+              </a:graphicData>
+            </a:graphic>
+          </wp:inline>
+        </w:drawing>
+      </w:r>
+    </w:p>
+    <w:p>
+      <w:pPr>
+        <w:jc w:val="center"/>
+      </w:pPr>
+      <w:r>
+        <w:rPr>
+          <w:i/>
+          <w:color w:val="555B66"/>
+          <w:sz w:val="18"/>
+        </w:rPr>
         <w:t>Activity 7 workflow — Finance API to Telegram day trader</w:t>
       </w:r>
     </w:p>
@@ -4898,7 +4950,7 @@
         <w:drawing>
           <wp:inline xmlns:a="http://schemas.openxmlformats.org/drawingml/2006/main" xmlns:pic="http://schemas.openxmlformats.org/drawingml/2006/picture">
             <wp:extent cx="5669280" cy="2092019"/>
-            <wp:docPr id="12" name="Picture 12"/>
+            <wp:docPr id="13" name="Picture 13"/>
             <wp:cNvGraphicFramePr>
               <a:graphicFrameLocks noChangeAspect="1"/>
             </wp:cNvGraphicFramePr>
@@ -4910,7 +4962,7 @@
                     <pic:cNvPicPr/>
                   </pic:nvPicPr>
                   <pic:blipFill>
-                    <a:blip r:embed="rId20"/>
+                    <a:blip r:embed="rId21"/>
                     <a:stretch>
                       <a:fillRect/>
                     </a:stretch>
@@ -5239,7 +5291,7 @@
         <w:drawing>
           <wp:inline xmlns:a="http://schemas.openxmlformats.org/drawingml/2006/main" xmlns:pic="http://schemas.openxmlformats.org/drawingml/2006/picture">
             <wp:extent cx="5669280" cy="2517667"/>
-            <wp:docPr id="13" name="Picture 13"/>
+            <wp:docPr id="14" name="Picture 14"/>
             <wp:cNvGraphicFramePr>
               <a:graphicFrameLocks noChangeAspect="1"/>
             </wp:cNvGraphicFramePr>
@@ -5251,7 +5303,7 @@
                     <pic:cNvPicPr/>
                   </pic:nvPicPr>
                   <pic:blipFill>
-                    <a:blip r:embed="rId21"/>
+                    <a:blip r:embed="rId22"/>
                     <a:stretch>
                       <a:fillRect/>
                     </a:stretch>
@@ -6435,7 +6487,7 @@
       </w:r>
     </w:p>
     <w:sectPr>
-      <w:footerReference w:type="default" r:id="rId22"/>
+      <w:footerReference w:type="default" r:id="rId23"/>
       <w:pgSz w:w="12240" w:h="15840"/>
       <w:pgMar w:top="1440" w:right="1800" w:bottom="1440" w:left="1800" w:header="720" w:footer="720" w:gutter="0"/>
       <w:cols w:space="720"/>

</xml_diff>

<commit_message>
Update n8n Automation Learner Guide.docx
</commit_message>
<xml_diff>
--- a/courseware/n8n Automation Learner Guide.docx
+++ b/courseware/n8n Automation Learner Guide.docx
@@ -3533,7 +3533,13 @@
         <w:t>Data Table</w:t>
       </w:r>
       <w:r>
-        <w:t xml:space="preserve"> it can look up. Now the same Telegram bot can answer HR-admin questions like "What department is Alice in?" by querying real data.</w:t>
+        <w:t xml:space="preserve"> it can look up. Now the same Telegram bot can answer HR-admin questions like "What department is </w:t>
+      </w:r>
+      <w:r>
+        <w:t>Nadia</w:t>
+      </w:r>
+      <w:r>
+        <w:t xml:space="preserve"> in?" by querying real data.</w:t>
       </w:r>
     </w:p>
     <w:p>
@@ -3639,15 +3645,7 @@
         <w:t>36</w:t>
       </w:r>
       <w:r>
-        <w:t xml:space="preserve"> </w:t>
-      </w:r>
-      <w:proofErr w:type="gramStart"/>
-      <w:r>
-        <w:t>records) —</w:t>
-      </w:r>
-      <w:proofErr w:type="gramEnd"/>
-      <w:r>
-        <w:t xml:space="preserve"> regenerate it any time with </w:t>
+        <w:t xml:space="preserve"> records) — regenerate it any time with </w:t>
       </w:r>
       <w:r>
         <w:rPr>

</xml_diff>

<commit_message>
update LG for activity 7
</commit_message>
<xml_diff>
--- a/courseware/n8n Automation Learner Guide.docx
+++ b/courseware/n8n Automation Learner Guide.docx
@@ -240,7 +240,6 @@
           <w:color w:val="111827"/>
           <w:sz w:val="24"/>
         </w:rPr>
-        <w:lastRenderedPageBreak/>
         <w:t>DOCUMENT VERSION CONTROL RECORD</w:t>
       </w:r>
     </w:p>
@@ -513,7 +512,6 @@
           <w:color w:val="111827"/>
           <w:sz w:val="24"/>
         </w:rPr>
-        <w:lastRenderedPageBreak/>
         <w:t>TABLE OF CONTENTS</w:t>
       </w:r>
     </w:p>
@@ -5026,7 +5024,6 @@
     </w:p>
     <w:p>
       <w:r>
-        <w:lastRenderedPageBreak/>
         <w:t xml:space="preserve">Welcome! This guide takes you click-by-click through every hands-on lab in the WSQ course </w:t>
       </w:r>
       <w:r>
@@ -5607,7 +5604,6 @@
           <w:rFonts w:ascii="Consolas" w:hAnsi="Consolas"/>
           <w:sz w:val="18"/>
         </w:rPr>
-        <w:lastRenderedPageBreak/>
         <w:t># labs/n8n-installation/docker-compose.yml</w:t>
       </w:r>
       <w:r>
@@ -5972,7 +5968,6 @@
           <w:b/>
           <w:color w:val="B56A00"/>
         </w:rPr>
-        <w:lastRenderedPageBreak/>
         <w:t xml:space="preserve">Note:  </w:t>
       </w:r>
       <w:r>
@@ -6329,7 +6324,6 @@
         <w:pStyle w:val="ListNumber"/>
       </w:pPr>
       <w:r>
-        <w:lastRenderedPageBreak/>
         <w:t xml:space="preserve">Add an </w:t>
       </w:r>
       <w:r>
@@ -6710,7 +6704,6 @@
           <w:color w:val="555B66"/>
           <w:sz w:val="18"/>
         </w:rPr>
-        <w:lastRenderedPageBreak/>
         <w:t>Activity 2 workflow — Form to Gmail + Data Table</w:t>
       </w:r>
     </w:p>
@@ -6968,7 +6961,6 @@
         <w:rPr>
           <w:noProof/>
         </w:rPr>
-        <w:lastRenderedPageBreak/>
         <w:drawing>
           <wp:inline distT="0" distB="0" distL="0" distR="0" wp14:anchorId="08808A6B" wp14:editId="464AD67B">
             <wp:extent cx="5669280" cy="3187395"/>
@@ -7306,7 +7298,6 @@
       </w:pPr>
       <w:bookmarkStart w:id="19" w:name="_Toc233278701"/>
       <w:r>
-        <w:lastRenderedPageBreak/>
         <w:t>Goal</w:t>
       </w:r>
       <w:bookmarkEnd w:id="19"/>
@@ -7636,7 +7627,6 @@
       </w:pPr>
       <w:bookmarkStart w:id="23" w:name="_Toc233278705"/>
       <w:r>
-        <w:lastRenderedPageBreak/>
         <w:t>Goal</w:t>
       </w:r>
       <w:bookmarkEnd w:id="23"/>
@@ -8050,7 +8040,6 @@
           <w:b/>
           <w:color w:val="127A3E"/>
         </w:rPr>
-        <w:lastRenderedPageBreak/>
         <w:t xml:space="preserve">✅ Test it:  </w:t>
       </w:r>
       <w:r>
@@ -8548,7 +8537,6 @@
         <w:rPr>
           <w:noProof/>
         </w:rPr>
-        <w:lastRenderedPageBreak/>
         <w:drawing>
           <wp:inline distT="0" distB="0" distL="0" distR="0" wp14:anchorId="611DE037" wp14:editId="522F76B2">
             <wp:extent cx="5669280" cy="2854577"/>
@@ -8831,7 +8819,6 @@
       </w:pPr>
       <w:bookmarkStart w:id="34" w:name="_Toc233278716"/>
       <w:r>
-        <w:lastRenderedPageBreak/>
         <w:t>Activity 5b — RAG with Pinecone (Persistent Vector Database)</w:t>
       </w:r>
       <w:bookmarkEnd w:id="34"/>
@@ -9108,7 +9095,6 @@
         <w:rPr>
           <w:noProof/>
         </w:rPr>
-        <w:lastRenderedPageBreak/>
         <w:drawing>
           <wp:inline distT="0" distB="0" distL="0" distR="0" wp14:anchorId="6F53EFA9" wp14:editId="021E179E">
             <wp:extent cx="5669280" cy="3543300"/>
@@ -9434,7 +9420,6 @@
         <w:pStyle w:val="ListNumber"/>
       </w:pPr>
       <w:r>
-        <w:lastRenderedPageBreak/>
         <w:t xml:space="preserve">Select the </w:t>
       </w:r>
       <w:r>
@@ -9674,7 +9659,6 @@
         <w:pStyle w:val="ListBullet"/>
       </w:pPr>
       <w:r>
-        <w:lastRenderedPageBreak/>
         <w:t>Use cases: website chat, form submissions, payment events, GitHub/Stripe notifications — any external trigger.</w:t>
       </w:r>
     </w:p>
@@ -9871,22 +9855,10 @@
           <w:b/>
           <w:color w:val="B56A00"/>
         </w:rPr>
-        <w:t>Note</w:t>
-      </w:r>
-      <w:proofErr w:type="gramStart"/>
-      <w:r>
-        <w:rPr>
-          <w:b/>
-          <w:color w:val="B56A00"/>
-        </w:rPr>
-        <w:t xml:space="preserve">:  </w:t>
-      </w:r>
-      <w:r>
-        <w:t>Get</w:t>
-      </w:r>
-      <w:proofErr w:type="gramEnd"/>
-      <w:r>
-        <w:t xml:space="preserve"> a few learners to present their live website and chatbot.</w:t>
+        <w:t xml:space="preserve">Note:  </w:t>
+      </w:r>
+      <w:r>
+        <w:t>Get a few learners to present their live website and chatbot.</w:t>
       </w:r>
     </w:p>
     <w:p>
@@ -9993,7 +9965,6 @@
         <w:rPr>
           <w:noProof/>
         </w:rPr>
-        <w:lastRenderedPageBreak/>
         <w:drawing>
           <wp:inline distT="0" distB="0" distL="0" distR="0" wp14:anchorId="45AE5CEE" wp14:editId="4D2FE74F">
             <wp:extent cx="5669280" cy="3371197"/>
@@ -10216,7 +10187,6 @@
         <w:rPr>
           <w:noProof/>
         </w:rPr>
-        <w:lastRenderedPageBreak/>
         <w:drawing>
           <wp:inline distT="0" distB="0" distL="0" distR="0" wp14:anchorId="41C99B2A" wp14:editId="6E526F73">
             <wp:extent cx="5669280" cy="3543300"/>
@@ -10340,7 +10310,6 @@
         <w:rPr>
           <w:noProof/>
         </w:rPr>
-        <w:lastRenderedPageBreak/>
         <w:drawing>
           <wp:inline distT="0" distB="0" distL="0" distR="0" wp14:anchorId="6B8A7CC5" wp14:editId="3AE18448">
             <wp:extent cx="5669280" cy="3543300"/>
@@ -10620,20 +10589,44 @@
       <w:r>
         <w:t xml:space="preserve"> HTTP Request node. </w:t>
       </w:r>
-      <w:r>
-        <w:rPr>
-          <w:b/>
-        </w:rPr>
-        <w:t>Authentication</w:t>
-      </w:r>
-      <w:r>
-        <w:t xml:space="preserve"> is already set to </w:t>
-      </w:r>
-      <w:r>
-        <w:rPr>
-          <w:b/>
-        </w:rPr>
-        <w:t>Generic Credential Type → Query Auth</w:t>
+    </w:p>
+    <w:p>
+      <w:pPr>
+        <w:pStyle w:val="ListNumber"/>
+        <w:numPr>
+          <w:ilvl w:val="0"/>
+          <w:numId w:val="29"/>
+        </w:numPr>
+      </w:pPr>
+      <w:r>
+        <w:t xml:space="preserve">Scroll to </w:t>
+      </w:r>
+      <w:r>
+        <w:rPr>
+          <w:b/>
+        </w:rPr>
+        <w:t>Query Parameters</w:t>
+      </w:r>
+      <w:r>
+        <w:t xml:space="preserve"> and find the parameter named </w:t>
+      </w:r>
+      <w:r>
+        <w:rPr>
+          <w:b/>
+        </w:rPr>
+        <w:t>`api</w:t>
+      </w:r>
+      <w:r>
+        <w:rPr>
+          <w:b/>
+        </w:rPr>
+        <w:t>K</w:t>
+      </w:r>
+      <w:r>
+        <w:rPr>
+          <w:b/>
+        </w:rPr>
+        <w:t>ey`</w:t>
       </w:r>
       <w:r>
         <w:t>.</w:t>
@@ -10642,101 +10635,43 @@
     <w:p>
       <w:pPr>
         <w:pStyle w:val="ListNumber"/>
-      </w:pPr>
-      <w:r>
-        <w:t xml:space="preserve">Click the </w:t>
-      </w:r>
-      <w:r>
-        <w:rPr>
-          <w:b/>
-        </w:rPr>
-        <w:t>Credential</w:t>
-      </w:r>
-      <w:r>
-        <w:t xml:space="preserve"> dropdown → </w:t>
-      </w:r>
-      <w:r>
-        <w:rPr>
-          <w:b/>
-        </w:rPr>
-        <w:t>Create New Credential</w:t>
-      </w:r>
-      <w:r>
-        <w:t>.</w:t>
-      </w:r>
-    </w:p>
-    <w:p>
-      <w:pPr>
-        <w:pStyle w:val="ListNumber"/>
-      </w:pPr>
-      <w:r>
-        <w:lastRenderedPageBreak/>
-        <w:t xml:space="preserve">Set </w:t>
-      </w:r>
-      <w:r>
-        <w:rPr>
-          <w:b/>
-        </w:rPr>
-        <w:t>Name</w:t>
-      </w:r>
-      <w:r>
-        <w:t xml:space="preserve"> = </w:t>
+        <w:numPr>
+          <w:ilvl w:val="0"/>
+          <w:numId w:val="29"/>
+        </w:numPr>
+      </w:pPr>
+      <w:r>
+        <w:t xml:space="preserve">Replace its value </w:t>
       </w:r>
       <w:r>
         <w:rPr>
           <w:rFonts w:ascii="Consolas" w:hAnsi="Consolas"/>
           <w:color w:val="C7254E"/>
         </w:rPr>
-        <w:t>apiKey</w:t>
-      </w:r>
-      <w:r>
-        <w:t xml:space="preserve"> and </w:t>
-      </w:r>
-      <w:r>
-        <w:rPr>
-          <w:b/>
-        </w:rPr>
-        <w:t>Value</w:t>
-      </w:r>
-      <w:r>
-        <w:t xml:space="preserve"> = your NewsAPI key, then </w:t>
-      </w:r>
-      <w:r>
-        <w:rPr>
-          <w:b/>
-        </w:rPr>
-        <w:t>Save</w:t>
-      </w:r>
-      <w:r>
-        <w:t xml:space="preserve">. (NewsAPI expects the key in a query parameter called </w:t>
+        <w:t>YOUR_</w:t>
       </w:r>
       <w:r>
         <w:rPr>
           <w:rFonts w:ascii="Consolas" w:hAnsi="Consolas"/>
           <w:color w:val="C7254E"/>
         </w:rPr>
-        <w:t>apiKey</w:t>
-      </w:r>
-      <w:r>
-        <w:t>.)</w:t>
-      </w:r>
-    </w:p>
-    <w:p>
-      <w:pPr>
-        <w:pStyle w:val="ListNumber"/>
-      </w:pPr>
-      <w:r>
-        <w:t xml:space="preserve">Back on the </w:t>
+        <w:t>NEWS</w:t>
       </w:r>
       <w:r>
         <w:rPr>
           <w:rFonts w:ascii="Consolas" w:hAnsi="Consolas"/>
           <w:color w:val="C7254E"/>
         </w:rPr>
-        <w:t>news</w:t>
-      </w:r>
-      <w:r>
-        <w:t xml:space="preserve"> node, make sure your new credential is selected.</w:t>
+        <w:t>_API_KEY</w:t>
+      </w:r>
+      <w:r>
+        <w:t xml:space="preserve"> with the key you copied from </w:t>
+      </w:r>
+      <w:r>
+        <w:t>News dashboard</w:t>
+      </w:r>
+      <w:r>
+        <w:t>.</w:t>
       </w:r>
     </w:p>
     <w:p>
@@ -10834,7 +10769,19 @@
         <w:t>index.html</w:t>
       </w:r>
       <w:r>
-        <w:t>, click the gear, and paste your Twelve Data key + Telegram bot username for the dashboard.</w:t>
+        <w:t>, click the gear, and paste your Twelve Data key</w:t>
+      </w:r>
+      <w:r>
+        <w:t xml:space="preserve"> (For the current webpage to pull the data from Twelve Data)</w:t>
+      </w:r>
+      <w:r>
+        <w:t xml:space="preserve"> + Telegram bot username for the dashboard</w:t>
+      </w:r>
+      <w:r>
+        <w:t xml:space="preserve"> (To link your web telegram in n8n)</w:t>
+      </w:r>
+      <w:r>
+        <w:t>.</w:t>
       </w:r>
     </w:p>
     <w:p>
@@ -11002,7 +10949,6 @@
         <w:pStyle w:val="ListBullet"/>
       </w:pPr>
       <w:r>
-        <w:lastRenderedPageBreak/>
         <w:t xml:space="preserve">A </w:t>
       </w:r>
       <w:r>
@@ -11336,7 +11282,6 @@
           <w:color w:val="555B66"/>
           <w:sz w:val="18"/>
         </w:rPr>
-        <w:lastRenderedPageBreak/>
         <w:t>Activity 8b workflow — pre/post guardrails around the agent</w:t>
       </w:r>
     </w:p>
@@ -11628,7 +11573,6 @@
       </w:pPr>
       <w:bookmarkStart w:id="63" w:name="_Toc233278745"/>
       <w:r>
-        <w:lastRenderedPageBreak/>
         <w:t>Assessment</w:t>
       </w:r>
       <w:bookmarkEnd w:id="63"/>
@@ -12364,7 +12308,6 @@
               <w:rPr>
                 <w:sz w:val="19"/>
               </w:rPr>
-              <w:lastRenderedPageBreak/>
               <w:t>Human in the loop</w:t>
             </w:r>
           </w:p>
@@ -12516,17 +12459,8 @@
         <w:color w:val="555B66"/>
         <w:sz w:val="15"/>
       </w:rPr>
-      <w:t xml:space="preserve">© 2026 Tertiary Infotech Academy Pte Ltd. All rights reserved.  </w:t>
+      <w:t>© 2026 Tertiary Infotech Academy Pte Ltd. All rights reserved.  ·  www.tertiarycourses.com.sg</w:t>
     </w:r>
-    <w:proofErr w:type="gramStart"/>
-    <w:r>
-      <w:rPr>
-        <w:color w:val="555B66"/>
-        <w:sz w:val="15"/>
-      </w:rPr>
-      <w:t>·  www.tertiarycourses.com.sg</w:t>
-    </w:r>
-    <w:proofErr w:type="gramEnd"/>
   </w:p>
 </w:ftr>
 </file>
@@ -12693,7 +12627,7 @@
   <w:abstractNum w:abstractNumId="7" w15:restartNumberingAfterBreak="0">
     <w:nsid w:val="FFFFFF88"/>
     <w:multiLevelType w:val="singleLevel"/>
-    <w:tmpl w:val="D0A62B40"/>
+    <w:tmpl w:val="910CF022"/>
     <w:lvl w:ilvl="0">
       <w:start w:val="1"/>
       <w:numFmt w:val="decimal"/>
@@ -12893,6 +12827,12 @@
     <w:lvlOverride w:ilvl="0">
       <w:startOverride w:val="1"/>
     </w:lvlOverride>
+  </w:num>
+  <w:num w:numId="33" w16cid:durableId="800416403">
+    <w:abstractNumId w:val="7"/>
+  </w:num>
+  <w:num w:numId="34" w16cid:durableId="1139541533">
+    <w:abstractNumId w:val="7"/>
   </w:num>
 </w:numbering>
 </file>
@@ -24317,6 +24257,18 @@
       <w:u w:val="single"/>
     </w:rPr>
   </w:style>
+  <w:style w:type="character" w:styleId="FollowedHyperlink">
+    <w:name w:val="FollowedHyperlink"/>
+    <w:basedOn w:val="DefaultParagraphFont"/>
+    <w:uiPriority w:val="99"/>
+    <w:semiHidden/>
+    <w:unhideWhenUsed/>
+    <w:rsid w:val="00104DDE"/>
+    <w:rPr>
+      <w:color w:val="800080" w:themeColor="followedHyperlink"/>
+      <w:u w:val="single"/>
+    </w:rPr>
+  </w:style>
 </w:styles>
 </file>
 

</xml_diff>